<commit_message>
Markup v1910: keep net debt at Company level, no definition
Co-Authored-By: Claude Fable 5.1 <noreply@anthropic.com>
Claude-Session: https://claude.ai/code/session_017WXGuxbkZxKJPwstVR3guK
</commit_message>
<xml_diff>
--- a/MJM - Secondary Term Sheet v20261029_1910 - Corsair markup.docx
+++ b/MJM - Secondary Term Sheet v20261029_1910 - Corsair markup.docx
@@ -80,7 +80,7 @@
         </w:rPr>
         <w:t xml:space="preserve">Efinity Insurance Group Spółka </w:t>
       </w:r>
-      <w:del w:id="1001" w:author="Corsair review" w:date="2026-10-29T19:26:14Z">
+      <w:del w:id="1001" w:author="Corsair review" w:date="2026-10-29T19:34:47Z">
         <w:r>
           <w:rPr>
             <w:rFonts w:ascii="Arial" w:hAnsi="Arial" w:cs="Arial"/>
@@ -88,7 +88,7 @@
           <w:delText xml:space="preserve">Ackyjna</w:delText>
         </w:r>
       </w:del>
-      <w:ins w:id="1002" w:author="Corsair review" w:date="2026-10-29T19:26:14Z">
+      <w:ins w:id="1002" w:author="Corsair review" w:date="2026-10-29T19:34:47Z">
         <w:r>
           <w:rPr>
             <w:rFonts w:ascii="Arial" w:hAnsi="Arial" w:cs="Arial"/>
@@ -1349,210 +1349,121 @@
                 <w:szCs w:val="22"/>
               </w:rPr>
             </w:pPr>
-            <w:del w:id="1005" w:author="Corsair review" w:date="2026-10-29T19:26:14Z">
-              <w:r>
-                <w:rPr>
-                  <w:rFonts w:ascii="Arial" w:hAnsi="Arial" w:cs="Arial"/>
-                  <w:sz w:val="22"/>
-                  <w:szCs w:val="22"/>
-                </w:rPr>
-                <w:delText>The aggregate purchase price for the Sale Shares (the “</w:delText>
-              </w:r>
-            </w:del>
-            <w:del w:id="1006" w:author="Corsair review" w:date="2026-10-29T19:26:14Z">
-              <w:r>
-                <w:rPr>
-                  <w:rFonts w:ascii="Arial" w:hAnsi="Arial" w:cs="Arial"/>
-                  <w:b/>
-                  <w:sz w:val="22"/>
-                  <w:szCs w:val="22"/>
-                </w:rPr>
-                <w:delText>Purchase Price</w:delText>
-              </w:r>
-            </w:del>
-            <w:del w:id="1007" w:author="Corsair review" w:date="2026-10-29T19:26:14Z">
-              <w:r>
-                <w:rPr>
-                  <w:rFonts w:ascii="Arial" w:hAnsi="Arial" w:cs="Arial"/>
-                  <w:sz w:val="22"/>
-                  <w:szCs w:val="22"/>
-                </w:rPr>
-                <w:delText xml:space="preserve">”) will be the amount to which the Sale Shares would be entitled under the distribution waterfall in the SHA on a notional Exit at the Agreed Valuation, after deduction of </w:delText>
-              </w:r>
-            </w:del>
-            <w:del w:id="1008" w:author="Corsair review" w:date="2026-10-29T19:26:14Z">
-              <w:r>
-                <w:rPr>
-                  <w:rFonts w:ascii="Arial" w:hAnsi="Arial" w:cs="Arial"/>
-                  <w:sz w:val="22"/>
-                  <w:szCs w:val="22"/>
-                </w:rPr>
-                <w:delText xml:space="preserve">the consolidated </w:delText>
-              </w:r>
-            </w:del>
-            <w:del w:id="1009" w:author="Corsair review" w:date="2026-10-29T19:26:14Z">
-              <w:r>
-                <w:rPr>
-                  <w:rFonts w:ascii="Arial" w:hAnsi="Arial" w:cs="Arial"/>
-                  <w:sz w:val="22"/>
-                  <w:szCs w:val="22"/>
-                </w:rPr>
-                <w:delText>net debt</w:delText>
-              </w:r>
-            </w:del>
-            <w:del w:id="1010" w:author="Corsair review" w:date="2026-10-29T19:26:14Z">
-              <w:r>
-                <w:rPr>
-                  <w:rFonts w:ascii="Arial" w:hAnsi="Arial" w:cs="Arial"/>
-                  <w:sz w:val="22"/>
-                  <w:szCs w:val="22"/>
-                </w:rPr>
-                <w:delText xml:space="preserve"> of the Company</w:delText>
-              </w:r>
-            </w:del>
-            <w:del w:id="1011" w:author="Corsair review" w:date="2026-10-29T19:26:14Z">
-              <w:r>
-                <w:rPr>
-                  <w:rFonts w:ascii="Arial" w:hAnsi="Arial" w:cs="Arial"/>
-                  <w:sz w:val="22"/>
-                  <w:szCs w:val="22"/>
-                </w:rPr>
-                <w:delText>,</w:delText>
-              </w:r>
-            </w:del>
-            <w:del w:id="1012" w:author="Corsair review" w:date="2026-10-29T19:26:14Z">
-              <w:r>
-                <w:rPr>
-                  <w:rFonts w:ascii="Arial" w:hAnsi="Arial" w:cs="Arial"/>
-                  <w:sz w:val="22"/>
-                  <w:szCs w:val="22"/>
-                </w:rPr>
-                <w:delText xml:space="preserve"> </w:delText>
-              </w:r>
-            </w:del>
-            <w:del w:id="1013" w:author="Corsair review" w:date="2026-10-29T19:26:14Z">
-              <w:r>
-                <w:rPr>
-                  <w:rFonts w:ascii="Arial" w:hAnsi="Arial" w:cs="Arial"/>
-                  <w:sz w:val="22"/>
-                  <w:szCs w:val="22"/>
-                </w:rPr>
-                <w:delText xml:space="preserve">as at </w:delText>
-              </w:r>
-            </w:del>
-            <w:del w:id="1014" w:author="Corsair review" w:date="2026-10-29T19:26:14Z">
-              <w:r>
-                <w:rPr>
-                  <w:rFonts w:ascii="Arial" w:hAnsi="Arial" w:cs="Arial"/>
-                  <w:sz w:val="22"/>
-                  <w:szCs w:val="22"/>
-                </w:rPr>
-                <w:delText>31 December 2026 (</w:delText>
-              </w:r>
-            </w:del>
-            <w:del w:id="1015" w:author="Corsair review" w:date="2026-10-29T19:26:14Z">
-              <w:r>
-                <w:rPr>
-                  <w:rFonts w:ascii="Arial" w:hAnsi="Arial" w:cs="Arial"/>
-                  <w:sz w:val="22"/>
-                  <w:szCs w:val="22"/>
-                </w:rPr>
-                <w:delText xml:space="preserve">the </w:delText>
-              </w:r>
-            </w:del>
-            <w:del w:id="1016" w:author="Corsair review" w:date="2026-10-29T19:26:14Z">
-              <w:r>
-                <w:rPr>
-                  <w:rFonts w:ascii="Arial" w:hAnsi="Arial" w:cs="Arial"/>
-                  <w:sz w:val="22"/>
-                  <w:szCs w:val="22"/>
-                </w:rPr>
-                <w:delText>“</w:delText>
-              </w:r>
-            </w:del>
-            <w:del w:id="1017" w:author="Corsair review" w:date="2026-10-29T19:26:14Z">
-              <w:r>
-                <w:rPr>
-                  <w:rFonts w:ascii="Arial" w:hAnsi="Arial" w:cs="Arial"/>
-                  <w:b/>
-                  <w:bCs/>
-                  <w:sz w:val="22"/>
-                  <w:szCs w:val="22"/>
-                </w:rPr>
-                <w:delText>Reference Date</w:delText>
-              </w:r>
-            </w:del>
-            <w:del w:id="1018" w:author="Corsair review" w:date="2026-10-29T19:26:14Z">
-              <w:r>
-                <w:rPr>
-                  <w:rFonts w:ascii="Arial" w:hAnsi="Arial" w:cs="Arial"/>
-                  <w:sz w:val="22"/>
-                  <w:szCs w:val="22"/>
-                </w:rPr>
-                <w:delText>”)</w:delText>
-              </w:r>
-            </w:del>
-            <w:ins w:id="1019" w:author="Corsair review" w:date="2026-10-29T19:26:14Z">
-              <w:r>
-                <w:rPr>
-                  <w:rFonts w:ascii="Arial" w:hAnsi="Arial" w:cs="Arial"/>
-                  <w:sz w:val="22"/>
-                  <w:szCs w:val="22"/>
-                </w:rPr>
-                <w:t xml:space="preserve">The aggregate purchase price for the Sale Shares (the “</w:t>
-              </w:r>
-              <w:r>
-                <w:rPr>
-                  <w:b/>
-                  <w:rFonts w:ascii="Arial" w:hAnsi="Arial" w:cs="Arial"/>
-                  <w:sz w:val="22"/>
-                  <w:szCs w:val="22"/>
-                </w:rPr>
-                <w:t xml:space="preserve">Purchase Price</w:t>
-              </w:r>
-              <w:r>
-                <w:rPr>
-                  <w:rFonts w:ascii="Arial" w:hAnsi="Arial" w:cs="Arial"/>
-                  <w:sz w:val="22"/>
-                  <w:szCs w:val="22"/>
-                </w:rPr>
-                <w:t xml:space="preserve">”) will be the amount to which the Sale Shares would be entitled under the distribution waterfall in the SHA on a notional Exit at the Agreed Valuation, after deduction of the consolidated net debt of Denali I and its subsidiaries (being borrowings and other debt-like items less cash) (“</w:t>
-              </w:r>
-              <w:r>
-                <w:rPr>
-                  <w:b/>
-                  <w:rFonts w:ascii="Arial" w:hAnsi="Arial" w:cs="Arial"/>
-                  <w:sz w:val="22"/>
-                  <w:szCs w:val="22"/>
-                </w:rPr>
-                <w:t xml:space="preserve">Net Debt</w:t>
-              </w:r>
-              <w:r>
-                <w:rPr>
-                  <w:rFonts w:ascii="Arial" w:hAnsi="Arial" w:cs="Arial"/>
-                  <w:sz w:val="22"/>
-                  <w:szCs w:val="22"/>
-                </w:rPr>
-                <w:t xml:space="preserve">”), as at 31 December 2026 (the “</w:t>
-              </w:r>
-              <w:r>
-                <w:rPr>
-                  <w:b/>
-                  <w:rFonts w:ascii="Arial" w:hAnsi="Arial" w:cs="Arial"/>
-                  <w:sz w:val="22"/>
-                  <w:szCs w:val="22"/>
-                </w:rPr>
-                <w:t xml:space="preserve">Reference Date</w:t>
-              </w:r>
-              <w:r>
-                <w:rPr>
-                  <w:rFonts w:ascii="Arial" w:hAnsi="Arial" w:cs="Arial"/>
-                  <w:sz w:val="22"/>
-                  <w:szCs w:val="22"/>
-                </w:rPr>
-                <w:t xml:space="preserve">”)</w:t>
-              </w:r>
-            </w:ins>
+            <w:r>
+              <w:rPr>
+                <w:rFonts w:ascii="Arial" w:hAnsi="Arial" w:cs="Arial"/>
+                <w:sz w:val="22"/>
+                <w:szCs w:val="22"/>
+              </w:rPr>
+              <w:t>The aggregate purchase price for the Sale Shares (the “</w:t>
+            </w:r>
+            <w:r>
+              <w:rPr>
+                <w:rFonts w:ascii="Arial" w:hAnsi="Arial" w:cs="Arial"/>
+                <w:b/>
+                <w:sz w:val="22"/>
+                <w:szCs w:val="22"/>
+              </w:rPr>
+              <w:t>Purchase Price</w:t>
+            </w:r>
+            <w:r>
+              <w:rPr>
+                <w:rFonts w:ascii="Arial" w:hAnsi="Arial" w:cs="Arial"/>
+                <w:sz w:val="22"/>
+                <w:szCs w:val="22"/>
+              </w:rPr>
+              <w:t xml:space="preserve">”) will be the amount to which the Sale Shares would be entitled under the distribution waterfall in the SHA on a notional Exit at the Agreed Valuation, after deduction of </w:t>
+            </w:r>
+            <w:r>
+              <w:rPr>
+                <w:rFonts w:ascii="Arial" w:hAnsi="Arial" w:cs="Arial"/>
+                <w:sz w:val="22"/>
+                <w:szCs w:val="22"/>
+              </w:rPr>
+              <w:t xml:space="preserve">the consolidated </w:t>
+            </w:r>
+            <w:r>
+              <w:rPr>
+                <w:rFonts w:ascii="Arial" w:hAnsi="Arial" w:cs="Arial"/>
+                <w:sz w:val="22"/>
+                <w:szCs w:val="22"/>
+              </w:rPr>
+              <w:t>net debt</w:t>
+            </w:r>
+            <w:r>
+              <w:rPr>
+                <w:rFonts w:ascii="Arial" w:hAnsi="Arial" w:cs="Arial"/>
+                <w:sz w:val="22"/>
+                <w:szCs w:val="22"/>
+              </w:rPr>
+              <w:t xml:space="preserve"> of the Company</w:t>
+            </w:r>
+            <w:r>
+              <w:rPr>
+                <w:rFonts w:ascii="Arial" w:hAnsi="Arial" w:cs="Arial"/>
+                <w:sz w:val="22"/>
+                <w:szCs w:val="22"/>
+              </w:rPr>
+              <w:t>,</w:t>
+            </w:r>
+            <w:r>
+              <w:rPr>
+                <w:rFonts w:ascii="Arial" w:hAnsi="Arial" w:cs="Arial"/>
+                <w:sz w:val="22"/>
+                <w:szCs w:val="22"/>
+              </w:rPr>
+              <w:t xml:space="preserve"> </w:t>
+            </w:r>
+            <w:r>
+              <w:rPr>
+                <w:rFonts w:ascii="Arial" w:hAnsi="Arial" w:cs="Arial"/>
+                <w:sz w:val="22"/>
+                <w:szCs w:val="22"/>
+              </w:rPr>
+              <w:t xml:space="preserve">as at </w:t>
+            </w:r>
+            <w:r>
+              <w:rPr>
+                <w:rFonts w:ascii="Arial" w:hAnsi="Arial" w:cs="Arial"/>
+                <w:sz w:val="22"/>
+                <w:szCs w:val="22"/>
+              </w:rPr>
+              <w:t>31 December 2026 (</w:t>
+            </w:r>
+            <w:r>
+              <w:rPr>
+                <w:rFonts w:ascii="Arial" w:hAnsi="Arial" w:cs="Arial"/>
+                <w:sz w:val="22"/>
+                <w:szCs w:val="22"/>
+              </w:rPr>
+              <w:t xml:space="preserve">the </w:t>
+            </w:r>
+            <w:r>
+              <w:rPr>
+                <w:rFonts w:ascii="Arial" w:hAnsi="Arial" w:cs="Arial"/>
+                <w:sz w:val="22"/>
+                <w:szCs w:val="22"/>
+              </w:rPr>
+              <w:t>“</w:t>
+            </w:r>
+            <w:r>
+              <w:rPr>
+                <w:rFonts w:ascii="Arial" w:hAnsi="Arial" w:cs="Arial"/>
+                <w:b/>
+                <w:bCs/>
+                <w:sz w:val="22"/>
+                <w:szCs w:val="22"/>
+              </w:rPr>
+              <w:t>Reference Date</w:t>
+            </w:r>
+            <w:r>
+              <w:rPr>
+                <w:rFonts w:ascii="Arial" w:hAnsi="Arial" w:cs="Arial"/>
+                <w:sz w:val="22"/>
+                <w:szCs w:val="22"/>
+              </w:rPr>
+              <w:t>”)</w:t>
+            </w:r>
           </w:p>
           <w:p>
             <w:pPr>
@@ -1573,7 +1484,7 @@
                 <w:szCs w:val="22"/>
               </w:rPr>
             </w:pPr>
-            <w:del w:id="1020" w:author="Corsair review" w:date="2026-10-29T19:26:14Z">
+            <w:del w:id="1005" w:author="Corsair review" w:date="2026-10-29T19:34:47Z">
               <w:r>
                 <w:rPr>
                   <w:rFonts w:ascii="Arial" w:hAnsi="Arial" w:cs="Arial"/>
@@ -1583,7 +1494,7 @@
                 <w:delText xml:space="preserve">The FY26A </w:delText>
               </w:r>
             </w:del>
-            <w:del w:id="1021" w:author="Corsair review" w:date="2026-10-29T19:26:14Z">
+            <w:del w:id="1006" w:author="Corsair review" w:date="2026-10-29T19:34:47Z">
               <w:r>
                 <w:rPr>
                   <w:rFonts w:ascii="Arial" w:hAnsi="Arial" w:cs="Arial"/>
@@ -1593,7 +1504,7 @@
                 <w:delText xml:space="preserve">preliminary financial statements </w:delText>
               </w:r>
             </w:del>
-            <w:del w:id="1022" w:author="Corsair review" w:date="2026-10-29T19:26:14Z">
+            <w:del w:id="1007" w:author="Corsair review" w:date="2026-10-29T19:34:47Z">
               <w:r>
                 <w:rPr>
                   <w:rFonts w:ascii="Arial" w:hAnsi="Arial" w:cs="Arial"/>
@@ -1603,7 +1514,7 @@
                 <w:delText>of the Company are expected to be available in late January / early February 2027</w:delText>
               </w:r>
             </w:del>
-            <w:del w:id="1023" w:author="Corsair review" w:date="2026-10-29T19:26:14Z">
+            <w:del w:id="1008" w:author="Corsair review" w:date="2026-10-29T19:34:47Z">
               <w:r>
                 <w:rPr>
                   <w:rFonts w:ascii="Arial" w:hAnsi="Arial" w:cs="Arial"/>
@@ -1613,7 +1524,7 @@
                 <w:delText xml:space="preserve"> and the </w:delText>
               </w:r>
             </w:del>
-            <w:del w:id="1024" w:author="Corsair review" w:date="2026-10-29T19:26:14Z">
+            <w:del w:id="1009" w:author="Corsair review" w:date="2026-10-29T19:34:47Z">
               <w:r>
                 <w:rPr>
                   <w:rFonts w:ascii="Arial" w:hAnsi="Arial" w:cs="Arial"/>
@@ -1623,7 +1534,7 @@
                 <w:delText>FY26 financial statements in May 2027</w:delText>
               </w:r>
             </w:del>
-            <w:ins w:id="1025" w:author="Corsair review" w:date="2026-10-29T19:26:14Z">
+            <w:ins w:id="1010" w:author="Corsair review" w:date="2026-10-29T19:34:47Z">
               <w:r>
                 <w:rPr>
                   <w:rFonts w:ascii="Arial" w:hAnsi="Arial" w:cs="Arial"/>
@@ -1699,7 +1610,7 @@
                 <w:szCs w:val="22"/>
               </w:rPr>
             </w:pPr>
-            <w:del w:id="1026" w:author="Corsair review" w:date="2026-10-29T19:26:14Z">
+            <w:del w:id="1011" w:author="Corsair review" w:date="2026-10-29T19:34:47Z">
               <w:r>
                 <w:rPr>
                   <w:rFonts w:ascii="Arial" w:hAnsi="Arial" w:cs="Arial"/>
@@ -1709,7 +1620,7 @@
                 <w:delText>“</w:delText>
               </w:r>
             </w:del>
-            <w:del w:id="1027" w:author="Corsair review" w:date="2026-10-29T19:26:14Z">
+            <w:del w:id="1012" w:author="Corsair review" w:date="2026-10-29T19:34:47Z">
               <w:r>
                 <w:rPr>
                   <w:rFonts w:ascii="Arial" w:hAnsi="Arial" w:cs="Arial"/>
@@ -1720,7 +1631,7 @@
                 <w:delText>Final FY26A Adjusted EBITDA</w:delText>
               </w:r>
             </w:del>
-            <w:del w:id="1028" w:author="Corsair review" w:date="2026-10-29T19:26:14Z">
+            <w:del w:id="1013" w:author="Corsair review" w:date="2026-10-29T19:34:47Z">
               <w:r>
                 <w:rPr>
                   <w:rFonts w:ascii="Arial" w:hAnsi="Arial" w:cs="Arial"/>
@@ -1730,7 +1641,7 @@
                 <w:delText xml:space="preserve">” means the Adjusted EBITDA of the Company for the financial year ending 31 December 2026 as shown in the Company’s audited FY26 financial statements, </w:delText>
               </w:r>
             </w:del>
-            <w:del w:id="1029" w:author="Corsair review" w:date="2026-10-29T19:26:14Z">
+            <w:del w:id="1014" w:author="Corsair review" w:date="2026-10-29T19:34:47Z">
               <w:r>
                 <w:rPr>
                   <w:rFonts w:ascii="Arial" w:hAnsi="Arial" w:cs="Arial"/>
@@ -1740,7 +1651,7 @@
                 <w:delText xml:space="preserve">with the EBITDA adjustments </w:delText>
               </w:r>
             </w:del>
-            <w:del w:id="1030" w:author="Corsair review" w:date="2026-10-29T19:26:14Z">
+            <w:del w:id="1015" w:author="Corsair review" w:date="2026-10-29T19:34:47Z">
               <w:r>
                 <w:rPr>
                   <w:rFonts w:ascii="Arial" w:hAnsi="Arial" w:cs="Arial"/>
@@ -1750,7 +1661,7 @@
                 <w:delText>calculated on the same basis</w:delText>
               </w:r>
             </w:del>
-            <w:del w:id="1031" w:author="Corsair review" w:date="2026-10-29T19:26:14Z">
+            <w:del w:id="1016" w:author="Corsair review" w:date="2026-10-29T19:34:47Z">
               <w:r>
                 <w:rPr>
                   <w:rFonts w:ascii="Arial" w:hAnsi="Arial" w:cs="Arial"/>
@@ -1760,7 +1671,7 @@
                 <w:delText xml:space="preserve"> as the Preliminary FY26A Adjusted EBITDA </w:delText>
               </w:r>
             </w:del>
-            <w:ins w:id="1032" w:author="Corsair review" w:date="2026-10-29T19:26:14Z">
+            <w:ins w:id="1017" w:author="Corsair review" w:date="2026-10-29T19:34:47Z">
               <w:r>
                 <w:rPr>
                   <w:rFonts w:ascii="Arial" w:hAnsi="Arial" w:cs="Arial"/>
@@ -1807,7 +1718,7 @@
                 <w:szCs w:val="22"/>
               </w:rPr>
             </w:pPr>
-            <w:del w:id="1033" w:author="Corsair review" w:date="2026-10-29T19:26:14Z">
+            <w:del w:id="1018" w:author="Corsair review" w:date="2026-10-29T19:34:47Z">
               <w:r>
                 <w:rPr>
                   <w:rFonts w:ascii="Arial" w:hAnsi="Arial" w:cs="Arial"/>
@@ -1817,7 +1728,7 @@
                 <w:delText>“</w:delText>
               </w:r>
             </w:del>
-            <w:del w:id="1034" w:author="Corsair review" w:date="2026-10-29T19:26:14Z">
+            <w:del w:id="1019" w:author="Corsair review" w:date="2026-10-29T19:34:47Z">
               <w:r>
                 <w:rPr>
                   <w:rFonts w:ascii="Arial" w:hAnsi="Arial" w:cs="Arial"/>
@@ -1828,7 +1739,7 @@
                 <w:delText>FY26A Adjusted EBITDA</w:delText>
               </w:r>
             </w:del>
-            <w:del w:id="1035" w:author="Corsair review" w:date="2026-10-29T19:26:14Z">
+            <w:del w:id="1020" w:author="Corsair review" w:date="2026-10-29T19:34:47Z">
               <w:r>
                 <w:rPr>
                   <w:rFonts w:ascii="Arial" w:hAnsi="Arial" w:cs="Arial"/>
@@ -1838,7 +1749,7 @@
                 <w:delText xml:space="preserve">” means the </w:delText>
               </w:r>
             </w:del>
-            <w:del w:id="1036" w:author="Corsair review" w:date="2026-10-29T19:26:14Z">
+            <w:del w:id="1021" w:author="Corsair review" w:date="2026-10-29T19:34:47Z">
               <w:r>
                 <w:rPr>
                   <w:rFonts w:ascii="Arial" w:hAnsi="Arial" w:cs="Arial"/>
@@ -1848,7 +1759,7 @@
                 <w:delText xml:space="preserve">Preliminary </w:delText>
               </w:r>
             </w:del>
-            <w:del w:id="1037" w:author="Corsair review" w:date="2026-10-29T19:26:14Z">
+            <w:del w:id="1022" w:author="Corsair review" w:date="2026-10-29T19:34:47Z">
               <w:r>
                 <w:rPr>
                   <w:rFonts w:ascii="Arial" w:hAnsi="Arial" w:cs="Arial"/>
@@ -1858,7 +1769,7 @@
                 <w:delText xml:space="preserve">FY26 </w:delText>
               </w:r>
             </w:del>
-            <w:del w:id="1038" w:author="Corsair review" w:date="2026-10-29T19:26:14Z">
+            <w:del w:id="1023" w:author="Corsair review" w:date="2026-10-29T19:34:47Z">
               <w:r>
                 <w:rPr>
                   <w:rFonts w:ascii="Arial" w:hAnsi="Arial" w:cs="Arial"/>
@@ -1868,7 +1779,7 @@
                 <w:delText xml:space="preserve">Adjusted </w:delText>
               </w:r>
             </w:del>
-            <w:del w:id="1039" w:author="Corsair review" w:date="2026-10-29T19:26:14Z">
+            <w:del w:id="1024" w:author="Corsair review" w:date="2026-10-29T19:34:47Z">
               <w:r>
                 <w:rPr>
                   <w:rFonts w:ascii="Arial" w:hAnsi="Arial" w:cs="Arial"/>
@@ -1878,7 +1789,7 @@
                 <w:delText xml:space="preserve">EBITDA </w:delText>
               </w:r>
             </w:del>
-            <w:del w:id="1040" w:author="Corsair review" w:date="2026-10-29T19:26:14Z">
+            <w:del w:id="1025" w:author="Corsair review" w:date="2026-10-29T19:34:47Z">
               <w:r>
                 <w:rPr>
                   <w:rFonts w:ascii="Arial" w:hAnsi="Arial" w:cs="Arial"/>
@@ -1888,7 +1799,7 @@
                 <w:delText xml:space="preserve">or, following any adjustment under the mechanism below, the Final </w:delText>
               </w:r>
             </w:del>
-            <w:del w:id="1041" w:author="Corsair review" w:date="2026-10-29T19:26:14Z">
+            <w:del w:id="1026" w:author="Corsair review" w:date="2026-10-29T19:34:47Z">
               <w:r>
                 <w:rPr>
                   <w:rFonts w:ascii="Arial" w:hAnsi="Arial" w:cs="Arial"/>
@@ -1898,7 +1809,7 @@
                 <w:delText xml:space="preserve">FY26 </w:delText>
               </w:r>
             </w:del>
-            <w:del w:id="1042" w:author="Corsair review" w:date="2026-10-29T19:26:14Z">
+            <w:del w:id="1027" w:author="Corsair review" w:date="2026-10-29T19:34:47Z">
               <w:r>
                 <w:rPr>
                   <w:rFonts w:ascii="Arial" w:hAnsi="Arial" w:cs="Arial"/>
@@ -1908,7 +1819,7 @@
                 <w:delText xml:space="preserve">Adjusted EBITDA </w:delText>
               </w:r>
             </w:del>
-            <w:ins w:id="1043" w:author="Corsair review" w:date="2026-10-29T19:26:14Z">
+            <w:ins w:id="1028" w:author="Corsair review" w:date="2026-10-29T19:34:47Z">
               <w:r>
                 <w:rPr>
                   <w:rFonts w:ascii="Arial" w:hAnsi="Arial" w:cs="Arial"/>
@@ -2054,7 +1965,7 @@
               </w:rPr>
             </w:pPr>
             <w:proofErr w:type="spellStart"/>
-            <w:del w:id="1044" w:author="Corsair review" w:date="2026-10-29T19:26:14Z">
+            <w:del w:id="1029" w:author="Corsair review" w:date="2026-10-29T19:34:47Z">
               <w:r>
                 <w:rPr>
                   <w:rFonts w:ascii="Arial" w:hAnsi="Arial" w:cs="Arial"/>
@@ -2065,7 +1976,7 @@
               </w:r>
             </w:del>
             <w:proofErr w:type="spellEnd"/>
-            <w:del w:id="1045" w:author="Corsair review" w:date="2026-10-29T19:26:14Z">
+            <w:del w:id="1030" w:author="Corsair review" w:date="2026-10-29T19:34:47Z">
               <w:r>
                 <w:rPr>
                   <w:rFonts w:ascii="Arial" w:hAnsi="Arial" w:cs="Arial"/>
@@ -2075,7 +1986,7 @@
                 <w:delText xml:space="preserve"> 10 Business Days of the audited FY26 financial statements being approved, CEIS will deliver to Efinity a statement (the “</w:delText>
               </w:r>
             </w:del>
-            <w:del w:id="1046" w:author="Corsair review" w:date="2026-10-29T19:26:14Z">
+            <w:del w:id="1031" w:author="Corsair review" w:date="2026-10-29T19:34:47Z">
               <w:r>
                 <w:rPr>
                   <w:rFonts w:ascii="Arial" w:hAnsi="Arial" w:cs="Arial"/>
@@ -2086,7 +1997,7 @@
                 <w:delText>Adjustment Statement</w:delText>
               </w:r>
             </w:del>
-            <w:del w:id="1047" w:author="Corsair review" w:date="2026-10-29T19:26:14Z">
+            <w:del w:id="1032" w:author="Corsair review" w:date="2026-10-29T19:34:47Z">
               <w:r>
                 <w:rPr>
                   <w:rFonts w:ascii="Arial" w:hAnsi="Arial" w:cs="Arial"/>
@@ -2096,7 +2007,7 @@
                 <w:delText>”) setting out the Final FY26A Adjusted EBITDA, the Purchase Price recalculated on that basis (the “</w:delText>
               </w:r>
             </w:del>
-            <w:del w:id="1048" w:author="Corsair review" w:date="2026-10-29T19:26:14Z">
+            <w:del w:id="1033" w:author="Corsair review" w:date="2026-10-29T19:34:47Z">
               <w:r>
                 <w:rPr>
                   <w:rFonts w:ascii="Arial" w:hAnsi="Arial" w:cs="Arial"/>
@@ -2107,7 +2018,7 @@
                 <w:delText>Final Purchase Price</w:delText>
               </w:r>
             </w:del>
-            <w:del w:id="1049" w:author="Corsair review" w:date="2026-10-29T19:26:14Z">
+            <w:del w:id="1034" w:author="Corsair review" w:date="2026-10-29T19:34:47Z">
               <w:r>
                 <w:rPr>
                   <w:rFonts w:ascii="Arial" w:hAnsi="Arial" w:cs="Arial"/>
@@ -2117,7 +2028,7 @@
                 <w:delText>”) and the adjustment payment (if any)</w:delText>
               </w:r>
             </w:del>
-            <w:ins w:id="1050" w:author="Corsair review" w:date="2026-10-29T19:26:14Z">
+            <w:ins w:id="1035" w:author="Corsair review" w:date="2026-10-29T19:34:47Z">
               <w:r>
                 <w:rPr>
                   <w:rFonts w:ascii="Arial" w:hAnsi="Arial" w:cs="Arial"/>
@@ -2141,7 +2052,7 @@
                   <w:sz w:val="22"/>
                   <w:szCs w:val="22"/>
                 </w:rPr>
-                <w:t xml:space="preserve">”) setting out the Final FY26A Adjusted EBITDA and the Net Debt as at the Reference Date, in each case derived from the audited FY26 financial statements, the Purchase Price recalculated on that basis (the “</w:t>
+                <w:t xml:space="preserve">”) setting out the Final FY26A Adjusted EBITDA and the consolidated net debt (including cash) of the Company as at the Reference Date, in each case derived from the audited FY26 financial statements, the Purchase Price recalculated on that basis (the “</w:t>
               </w:r>
               <w:r>
                 <w:rPr>
@@ -2181,7 +2092,7 @@
                 <w:szCs w:val="22"/>
               </w:rPr>
             </w:pPr>
-            <w:del w:id="1051" w:author="Corsair review" w:date="2026-10-29T19:26:14Z">
+            <w:del w:id="1036" w:author="Corsair review" w:date="2026-10-29T19:34:47Z">
               <w:r>
                 <w:rPr>
                   <w:rFonts w:ascii="Arial" w:hAnsi="Arial" w:cs="Arial"/>
@@ -2191,7 +2102,7 @@
                 <w:delText>If the Final FY26A Adjusted EBITDA is greater than 10</w:delText>
               </w:r>
             </w:del>
-            <w:del w:id="1052" w:author="Corsair review" w:date="2026-10-29T19:26:14Z">
+            <w:del w:id="1037" w:author="Corsair review" w:date="2026-10-29T19:34:47Z">
               <w:r>
                 <w:rPr>
                   <w:rFonts w:ascii="Arial" w:hAnsi="Arial" w:cs="Arial"/>
@@ -2201,7 +2112,7 @@
                 <w:delText>1</w:delText>
               </w:r>
             </w:del>
-            <w:del w:id="1053" w:author="Corsair review" w:date="2026-10-29T19:26:14Z">
+            <w:del w:id="1038" w:author="Corsair review" w:date="2026-10-29T19:34:47Z">
               <w:r>
                 <w:rPr>
                   <w:rFonts w:ascii="Arial" w:hAnsi="Arial" w:cs="Arial"/>
@@ -2211,7 +2122,7 @@
                 <w:delText>% or less than 9</w:delText>
               </w:r>
             </w:del>
-            <w:del w:id="1054" w:author="Corsair review" w:date="2026-10-29T19:26:14Z">
+            <w:del w:id="1039" w:author="Corsair review" w:date="2026-10-29T19:34:47Z">
               <w:r>
                 <w:rPr>
                   <w:rFonts w:ascii="Arial" w:hAnsi="Arial" w:cs="Arial"/>
@@ -2221,7 +2132,7 @@
                 <w:delText>9</w:delText>
               </w:r>
             </w:del>
-            <w:del w:id="1055" w:author="Corsair review" w:date="2026-10-29T19:26:14Z">
+            <w:del w:id="1040" w:author="Corsair review" w:date="2026-10-29T19:34:47Z">
               <w:r>
                 <w:rPr>
                   <w:rFonts w:ascii="Arial" w:hAnsi="Arial" w:cs="Arial"/>
@@ -2231,7 +2142,7 @@
                 <w:delText xml:space="preserve">% of the Preliminary FY26A Adjusted EBITDA, the Purchase Price will be adjusted to the Final Purchase Price and the full difference will be paid: by CEIS to Efinity if the Final Purchase Price is higher; or by Efinity to CEIS first by release of the Holdback Amount and then in cash for any excess if it is lower. If the Final FY26A Adjusted EBITDA is within that range, no adjustment will be </w:delText>
               </w:r>
             </w:del>
-            <w:del w:id="1056" w:author="Corsair review" w:date="2026-10-29T19:26:14Z">
+            <w:del w:id="1041" w:author="Corsair review" w:date="2026-10-29T19:34:47Z">
               <w:r>
                 <w:rPr>
                   <w:rFonts w:ascii="Arial" w:hAnsi="Arial" w:cs="Arial"/>
@@ -2242,7 +2153,7 @@
                 <w:delText>made and the Preliminary Purchase Price will be the Purchase Price and the Holdback Amount will be released to Efinity</w:delText>
               </w:r>
             </w:del>
-            <w:ins w:id="1057" w:author="Corsair review" w:date="2026-10-29T19:26:14Z">
+            <w:ins w:id="1042" w:author="Corsair review" w:date="2026-10-29T19:34:47Z">
               <w:r>
                 <w:rPr>
                   <w:rFonts w:ascii="Arial" w:hAnsi="Arial" w:cs="Arial"/>
@@ -3487,7 +3398,7 @@
               <w:ind w:left="357" w:hanging="357"/>
               <w:contextualSpacing/>
               <w:rPr>
-                <w:del w:id="1058" w:author="Corsair review" w:date="2026-10-29T19:26:14Z"/>
+                <w:del w:id="1043" w:author="Corsair review" w:date="2026-10-29T19:34:47Z"/>
                 <w:rFonts w:ascii="Arial" w:hAnsi="Arial" w:cs="Arial"/>
                 <w:sz w:val="22"/>
                 <w:szCs w:val="22"/>
@@ -4311,7 +4222,7 @@
         </w:rPr>
         <w:t xml:space="preserve">EFINITY INSURANCE GROUP SPÓŁKA </w:t>
       </w:r>
-      <w:del w:id="1003" w:author="Corsair review" w:date="2026-10-29T19:26:14Z">
+      <w:del w:id="1003" w:author="Corsair review" w:date="2026-10-29T19:34:47Z">
         <w:r>
           <w:rPr>
             <w:rFonts w:ascii="Arial" w:hAnsi="Arial" w:cs="Arial"/>
@@ -4321,7 +4232,7 @@
           <w:delText xml:space="preserve">ACKYJNA</w:delText>
         </w:r>
       </w:del>
-      <w:ins w:id="1004" w:author="Corsair review" w:date="2026-10-29T19:26:14Z">
+      <w:ins w:id="1004" w:author="Corsair review" w:date="2026-10-29T19:34:47Z">
         <w:r>
           <w:rPr>
             <w:rFonts w:ascii="Arial" w:hAnsi="Arial" w:cs="Arial"/>

</xml_diff>